<commit_message>
docs(practicals): update practicals 7-12 docx with sanitized author metadata and GitHub links
</commit_message>
<xml_diff>
--- a/24CE089_Practical_7to12.docx
+++ b/24CE089_Practical_7to12.docx
@@ -5252,7 +5252,7 @@
                 <w:color w:val="2563EB"/>
                 <w:u w:val="single"/>
               </w:rPr>
-              <w:t>https://github.com/kavyamrutiya/ITUE301-AWDF-Practicals/tree/main/Practical_07_JWT_Authentication</w:t>
+              <w:t>https://github.com/Nilay-Patel-5/ITUE301-AWDF-Practicals/tree/main/Practical_07_JWT_Authentication</w:t>
             </w:r>
           </w:p>
           <w:p>
@@ -5266,7 +5266,7 @@
                 <w:sz w:val="20"/>
                 <w:szCs w:val="20"/>
               </w:rPr>
-              <w:t>• Repository: https://github.com/kavyamrutiya/ITUE301-AWDF-Practicals</w:t>
+              <w:t>• Repository: https://github.com/Nilay-Patel-5/ITUE301-AWDF-Practicals</w:t>
             </w:r>
           </w:p>
           <w:p>
@@ -9309,7 +9309,7 @@
                 <w:color w:val="2563EB"/>
                 <w:u w:val="single"/>
               </w:rPr>
-              <w:t>https://github.com/kavyamrutiya/ITUE301-AWDF-Practicals/tree/main/Practical_08_Lazy_Loading</w:t>
+              <w:t>https://github.com/Nilay-Patel-5/ITUE301-AWDF-Practicals/tree/main/Practical_08_Lazy_Loading</w:t>
             </w:r>
           </w:p>
           <w:p>
@@ -9323,7 +9323,7 @@
                 <w:sz w:val="20"/>
                 <w:szCs w:val="20"/>
               </w:rPr>
-              <w:t>• Repository: https://github.com/kavyamrutiya/ITUE301-AWDF-Practicals</w:t>
+              <w:t>• Repository: https://github.com/Nilay-Patel-5/ITUE301-AWDF-Practicals</w:t>
             </w:r>
           </w:p>
           <w:p>
@@ -14254,7 +14254,7 @@
                 <w:color w:val="2563EB"/>
                 <w:u w:val="single"/>
               </w:rPr>
-              <w:t>https://github.com/kavyamrutiya/ITUE301-AWDF-Practicals/tree/main/Practical_09_Caching</w:t>
+              <w:t>https://github.com/Nilay-Patel-5/ITUE301-AWDF-Practicals/tree/main/Practical_09_Caching</w:t>
             </w:r>
           </w:p>
           <w:p>
@@ -14268,7 +14268,7 @@
                 <w:sz w:val="20"/>
                 <w:szCs w:val="20"/>
               </w:rPr>
-              <w:t>• Repository: https://github.com/kavyamrutiya/ITUE301-AWDF-Practicals</w:t>
+              <w:t>• Repository: https://github.com/Nilay-Patel-5/ITUE301-AWDF-Practicals</w:t>
             </w:r>
           </w:p>
           <w:p>
@@ -19640,7 +19640,7 @@
                 <w:color w:val="2563EB"/>
                 <w:u w:val="single"/>
               </w:rPr>
-              <w:t>https://github.com/kavyamrutiya/ITUE301-AWDF-Practicals/tree/main/Practical_10_EventEmitter</w:t>
+              <w:t>https://github.com/Nilay-Patel-5/ITUE301-AWDF-Practicals/tree/main/Practical_10_EventEmitter</w:t>
             </w:r>
           </w:p>
           <w:p>
@@ -19654,7 +19654,7 @@
                 <w:sz w:val="20"/>
                 <w:szCs w:val="20"/>
               </w:rPr>
-              <w:t>• Repository: https://github.com/kavyamrutiya/ITUE301-AWDF-Practicals</w:t>
+              <w:t>• Repository: https://github.com/Nilay-Patel-5/ITUE301-AWDF-Practicals</w:t>
             </w:r>
           </w:p>
           <w:p>
@@ -23193,7 +23193,7 @@
                 <w:color w:val="2563EB"/>
                 <w:u w:val="single"/>
               </w:rPr>
-              <w:t>https://github.com/kavyamrutiya/ITUE301-AWDF-Practicals/tree/main/Practical_11_Docker</w:t>
+              <w:t>https://github.com/Nilay-Patel-5/ITUE301-AWDF-Practicals/tree/main/Practical_11_Docker</w:t>
             </w:r>
           </w:p>
           <w:p>
@@ -23207,7 +23207,7 @@
                 <w:sz w:val="20"/>
                 <w:szCs w:val="20"/>
               </w:rPr>
-              <w:t>• Repository: https://github.com/kavyamrutiya/ITUE301-AWDF-Practicals</w:t>
+              <w:t>• Repository: https://github.com/Nilay-Patel-5/ITUE301-AWDF-Practicals</w:t>
             </w:r>
           </w:p>
           <w:p>
@@ -24037,17 +24037,16 @@
                 <w:sz w:val="17"/>
                 <w:szCs w:val="17"/>
               </w:rPr>
-              <w:t xml:space="preserve"># Author: Kavy </w:t>
-            </w:r>
-            <w:proofErr w:type="spellStart"/>
-            <w:r>
-              <w:rPr>
-                <w:rFonts w:ascii="Courier New" w:eastAsia="Courier New" w:hAnsi="Courier New" w:cs="Courier New"/>
-                <w:color w:val="212529"/>
-                <w:sz w:val="17"/>
-                <w:szCs w:val="17"/>
-              </w:rPr>
-              <w:t>Amrutiya</w:t>
+              <w:t># Author: Nilay Patel (24CE089)</w:t>
+            </w:r>
+            <w:proofErr w:type="spellStart"/>
+            <w:r>
+              <w:rPr>
+                <w:rFonts w:ascii="Courier New" w:eastAsia="Courier New" w:hAnsi="Courier New" w:cs="Courier New"/>
+                <w:color w:val="212529"/>
+                <w:sz w:val="17"/>
+                <w:szCs w:val="17"/>
+              </w:rPr>
             </w:r>
             <w:proofErr w:type="spellEnd"/>
           </w:p>
@@ -27677,7 +27676,7 @@
                 <w:color w:val="2563EB"/>
                 <w:u w:val="single"/>
               </w:rPr>
-              <w:t>https://github.com/kavyamrutiya/ITUE301-AWDF-Practicals/tree/main/Practical_12_CI_CD_Pipeline</w:t>
+              <w:t>https://github.com/Nilay-Patel-5/ITUE301-AWDF-Practicals/tree/main/Practical_12_CI_CD_Pipeline</w:t>
             </w:r>
           </w:p>
           <w:p>
@@ -27691,7 +27690,7 @@
                 <w:sz w:val="20"/>
                 <w:szCs w:val="20"/>
               </w:rPr>
-              <w:t>• Repository: https://github.com/kavyamrutiya/ITUE301-AWDF-Practicals</w:t>
+              <w:t>• Repository: https://github.com/Nilay-Patel-5/ITUE301-AWDF-Practicals</w:t>
             </w:r>
           </w:p>
           <w:p>

</xml_diff>